<commit_message>
Added few missed test cases
</commit_message>
<xml_diff>
--- a/Manual Testing/Test_Cases.docx
+++ b/Manual Testing/Test_Cases.docx
@@ -1186,9 +1186,9 @@
       </w:tblPr>
       <w:tblGrid>
         <w:gridCol w:w="1261"/>
-        <w:gridCol w:w="3483"/>
-        <w:gridCol w:w="2370"/>
-        <w:gridCol w:w="2236"/>
+        <w:gridCol w:w="2947"/>
+        <w:gridCol w:w="3156"/>
+        <w:gridCol w:w="1986"/>
       </w:tblGrid>
       <w:tr>
         <w:tc>
@@ -1459,6 +1459,119 @@
             </w:pPr>
             <w:r>
               <w:t>User is redirected to Login page</w:t>
+            </w:r>
+          </w:p>
+        </w:tc>
+      </w:tr>
+      <w:tr>
+        <w:tc>
+          <w:tcPr>
+            <w:tcW w:w="0" w:type="auto"/>
+          </w:tcPr>
+          <w:p>
+            <w:r>
+              <w:t>DASH_F_04</w:t>
+            </w:r>
+          </w:p>
+        </w:tc>
+        <w:tc>
+          <w:tcPr>
+            <w:tcW w:w="0" w:type="auto"/>
+          </w:tcPr>
+          <w:p>
+            <w:pPr>
+              <w:rPr>
+                <w:bCs/>
+              </w:rPr>
+            </w:pPr>
+            <w:r>
+              <w:t>Verify that user can logout successfully from dashboard</w:t>
+            </w:r>
+          </w:p>
+        </w:tc>
+        <w:tc>
+          <w:tcPr>
+            <w:tcW w:w="0" w:type="auto"/>
+          </w:tcPr>
+          <w:p>
+            <w:r>
+              <w:t>Click Logout button</w:t>
+            </w:r>
+          </w:p>
+        </w:tc>
+        <w:tc>
+          <w:tcPr>
+            <w:tcW w:w="0" w:type="auto"/>
+          </w:tcPr>
+          <w:p>
+            <w:r>
+              <w:t>User is redirected to Login page</w:t>
+            </w:r>
+          </w:p>
+        </w:tc>
+      </w:tr>
+      <w:tr>
+        <w:tc>
+          <w:tcPr>
+            <w:tcW w:w="0" w:type="auto"/>
+          </w:tcPr>
+          <w:p>
+            <w:r>
+              <w:t>DASH_F_05</w:t>
+            </w:r>
+          </w:p>
+        </w:tc>
+        <w:tc>
+          <w:tcPr>
+            <w:tcW w:w="0" w:type="auto"/>
+          </w:tcPr>
+          <w:p>
+            <w:pPr>
+              <w:rPr>
+                <w:bCs/>
+              </w:rPr>
+            </w:pPr>
+            <w:r>
+              <w:t>Verify that user session is terminated after logout</w:t>
+            </w:r>
+          </w:p>
+        </w:tc>
+        <w:tc>
+          <w:tcPr>
+            <w:tcW w:w="0" w:type="auto"/>
+          </w:tcPr>
+          <w:p>
+            <w:r>
+              <w:t xml:space="preserve">Logout → Press </w:t>
+            </w:r>
+            <w:r>
+              <w:t xml:space="preserve">the </w:t>
+            </w:r>
+            <w:bookmarkStart w:id="0" w:name="_GoBack"/>
+            <w:bookmarkEnd w:id="0"/>
+            <w:r>
+              <w:t xml:space="preserve">browser back </w:t>
+            </w:r>
+            <w:proofErr w:type="gramStart"/>
+            <w:r>
+              <w:t>button</w:t>
+            </w:r>
+            <w:r>
+              <w:t>(</w:t>
+            </w:r>
+            <w:proofErr w:type="gramEnd"/>
+            <w:r>
+              <w:t>on the top right corner)</w:t>
+            </w:r>
+          </w:p>
+        </w:tc>
+        <w:tc>
+          <w:tcPr>
+            <w:tcW w:w="0" w:type="auto"/>
+          </w:tcPr>
+          <w:p>
+            <w:r>
+              <w:t>Dashboard is not accessible</w:t>
             </w:r>
           </w:p>
         </w:tc>
@@ -1795,6 +1908,7 @@
               <w:spacing w:after="160" w:line="259" w:lineRule="auto"/>
             </w:pPr>
             <w:r>
+              <w:lastRenderedPageBreak/>
               <w:t>HAB_F_04</w:t>
             </w:r>
           </w:p>
@@ -1874,7 +1988,6 @@
           <w:b/>
           <w:bCs/>
         </w:rPr>
-        <w:lastRenderedPageBreak/>
         <w:t xml:space="preserve">1.6 </w:t>
       </w:r>
       <w:r>
@@ -2780,6 +2893,7 @@
           </w:tcPr>
           <w:p>
             <w:r>
+              <w:lastRenderedPageBreak/>
               <w:t>VAL_05</w:t>
             </w:r>
           </w:p>
@@ -2900,7 +3014,6 @@
           </w:tcPr>
           <w:p>
             <w:r>
-              <w:lastRenderedPageBreak/>
               <w:t>VAL_08</w:t>
             </w:r>
           </w:p>
@@ -3012,10 +3125,7 @@
         </w:tc>
       </w:tr>
     </w:tbl>
-    <w:p>
-      <w:bookmarkStart w:id="0" w:name="_GoBack"/>
-      <w:bookmarkEnd w:id="0"/>
-    </w:p>
+    <w:p/>
     <w:p/>
     <w:p/>
     <w:p>

</xml_diff>